<commit_message>
fix: timeouts Spin como rest-client (quita spin.*-timeout-ms no mapeadas)
</commit_message>
<xml_diff>
--- a/docs/Runbook_v0.1.docx
+++ b/docs/Runbook_v0.1.docx
@@ -310,6 +310,88 @@
                 <w:sz w:val="20"/>
               </w:rPr>
               <w:t>Agregada sección 4.5: arranque paso a paso en OpenShift Developer Sandbox.</w:t>
+            </w:r>
+          </w:p>
+        </w:tc>
+      </w:tr>
+      <w:tr>
+        <w:tc>
+          <w:tcPr>
+            <w:tcW w:type="dxa" w:w="2351"/>
+          </w:tcPr>
+          <w:p>
+            <w:r>
+              <w:rPr>
+                <w:rFonts w:ascii="Calibri" w:hAnsi="Calibri"/>
+                <w:sz w:val="20"/>
+              </w:rPr>
+            </w:r>
+            <w:r>
+              <w:rPr>
+                <w:rFonts w:ascii="Calibri" w:hAnsi="Calibri"/>
+                <w:sz w:val="20"/>
+              </w:rPr>
+              <w:t>0.3</w:t>
+            </w:r>
+          </w:p>
+        </w:tc>
+        <w:tc>
+          <w:tcPr>
+            <w:tcW w:type="dxa" w:w="2351"/>
+          </w:tcPr>
+          <w:p>
+            <w:r>
+              <w:rPr>
+                <w:rFonts w:ascii="Calibri" w:hAnsi="Calibri"/>
+                <w:sz w:val="20"/>
+              </w:rPr>
+            </w:r>
+            <w:r>
+              <w:rPr>
+                <w:rFonts w:ascii="Calibri" w:hAnsi="Calibri"/>
+                <w:sz w:val="20"/>
+              </w:rPr>
+              <w:t>08/06/2026</w:t>
+            </w:r>
+          </w:p>
+        </w:tc>
+        <w:tc>
+          <w:tcPr>
+            <w:tcW w:type="dxa" w:w="2351"/>
+          </w:tcPr>
+          <w:p>
+            <w:r>
+              <w:rPr>
+                <w:rFonts w:ascii="Calibri" w:hAnsi="Calibri"/>
+                <w:sz w:val="20"/>
+              </w:rPr>
+            </w:r>
+            <w:r>
+              <w:rPr>
+                <w:rFonts w:ascii="Calibri" w:hAnsi="Calibri"/>
+                <w:sz w:val="20"/>
+              </w:rPr>
+              <w:t>Roberto Castillo</w:t>
+            </w:r>
+          </w:p>
+        </w:tc>
+        <w:tc>
+          <w:tcPr>
+            <w:tcW w:type="dxa" w:w="2351"/>
+          </w:tcPr>
+          <w:p>
+            <w:r>
+              <w:rPr>
+                <w:rFonts w:ascii="Calibri" w:hAnsi="Calibri"/>
+                <w:sz w:val="20"/>
+              </w:rPr>
+            </w:r>
+            <w:r>
+              <w:rPr>
+                <w:rFonts w:ascii="Calibri" w:hAnsi="Calibri"/>
+                <w:sz w:val="20"/>
+              </w:rPr>
+              <w:t>Sección 4.5: agregado paso de clonación del repo en terminal (Web Terminal / local) y nota de estructura aplanada.</w:t>
             </w:r>
           </w:p>
         </w:tc>
@@ -1960,14 +2042,213 @@
           <w:b/>
           <w:sz w:val="22"/>
         </w:rPr>
-        <w:t>Paso 5 — Desplegar el servicio (un comando).</w:t>
+        <w:t>Paso 5 — Clonar el repositorio en la terminal.</w:t>
       </w:r>
       <w:r>
         <w:rPr>
           <w:rFonts w:ascii="Calibri" w:hAnsi="Calibri"/>
           <w:sz w:val="22"/>
         </w:rPr>
-        <w:t xml:space="preserve"> Desde la raíz del repo:</w:t>
+        <w:t xml:space="preserve"> El script necesita los archivos del repo localmente (manifiestos, realm, mappings) para aplicarlos.</w:t>
+      </w:r>
+    </w:p>
+    <w:p>
+      <w:r>
+        <w:rPr>
+          <w:rFonts w:ascii="Calibri" w:hAnsi="Calibri"/>
+          <w:i/>
+          <w:color w:val="555555"/>
+          <w:sz w:val="20"/>
+        </w:rPr>
+        <w:t>En la **Web Terminal** de OpenShift (ícono `&gt;_` arriba en la consola → *Start*) ya tienes `oc` autenticado a tu namespace y `git` disponibles, así que puedes **omitir los Pasos 3 y 4**. En una terminal local, primero completa el login (Pasos 3-4) y ten `git` instalado.</w:t>
+      </w:r>
+    </w:p>
+    <w:p>
+      <w:pPr>
+        <w:shd w:val="clear" w:fill="F2F2F2"/>
+      </w:pPr>
+      <w:r>
+        <w:rPr>
+          <w:rFonts w:ascii="Consolas" w:hAnsi="Consolas"/>
+          <w:sz w:val="18"/>
+        </w:rPr>
+        <w:t>git clone https://github.com/castellconde/spin-comision-variable.git</w:t>
+        <w:br/>
+        <w:t>cd spin-comision-variable</w:t>
+      </w:r>
+    </w:p>
+    <w:p>
+      <w:r>
+        <w:rPr>
+          <w:rFonts w:ascii="Calibri" w:hAnsi="Calibri"/>
+          <w:sz w:val="22"/>
+        </w:rPr>
+        <w:t>Si ya lo habías clonado antes, sólo actualízalo:</w:t>
+      </w:r>
+    </w:p>
+    <w:p>
+      <w:pPr>
+        <w:shd w:val="clear" w:fill="F2F2F2"/>
+      </w:pPr>
+      <w:r>
+        <w:rPr>
+          <w:rFonts w:ascii="Consolas" w:hAnsi="Consolas"/>
+          <w:sz w:val="18"/>
+        </w:rPr>
+        <w:t>cd spin-comision-variable &amp;&amp; git pull</w:t>
+      </w:r>
+    </w:p>
+    <w:p>
+      <w:r>
+        <w:rPr>
+          <w:rFonts w:ascii="Calibri" w:hAnsi="Calibri"/>
+          <w:sz w:val="22"/>
+        </w:rPr>
+        <w:t xml:space="preserve">El repositorio está </w:t>
+      </w:r>
+      <w:r>
+        <w:rPr>
+          <w:rFonts w:ascii="Calibri" w:hAnsi="Calibri"/>
+          <w:b/>
+          <w:sz w:val="22"/>
+        </w:rPr>
+        <w:t>aplanado</w:t>
+      </w:r>
+      <w:r>
+        <w:rPr>
+          <w:rFonts w:ascii="Calibri" w:hAnsi="Calibri"/>
+          <w:sz w:val="22"/>
+        </w:rPr>
+        <w:t xml:space="preserve">: la raíz contiene </w:t>
+      </w:r>
+      <w:r>
+        <w:rPr>
+          <w:rFonts w:ascii="Calibri" w:hAnsi="Calibri"/>
+          <w:sz w:val="20"/>
+        </w:rPr>
+        <w:t>Dockerfile</w:t>
+      </w:r>
+      <w:r>
+        <w:rPr>
+          <w:rFonts w:ascii="Calibri" w:hAnsi="Calibri"/>
+          <w:sz w:val="22"/>
+        </w:rPr>
+        <w:t xml:space="preserve">, </w:t>
+      </w:r>
+      <w:r>
+        <w:rPr>
+          <w:rFonts w:ascii="Calibri" w:hAnsi="Calibri"/>
+          <w:sz w:val="20"/>
+        </w:rPr>
+        <w:t>pom.xml</w:t>
+      </w:r>
+      <w:r>
+        <w:rPr>
+          <w:rFonts w:ascii="Calibri" w:hAnsi="Calibri"/>
+          <w:sz w:val="22"/>
+        </w:rPr>
+        <w:t xml:space="preserve">, </w:t>
+      </w:r>
+      <w:r>
+        <w:rPr>
+          <w:rFonts w:ascii="Calibri" w:hAnsi="Calibri"/>
+          <w:sz w:val="20"/>
+        </w:rPr>
+        <w:t>src/</w:t>
+      </w:r>
+      <w:r>
+        <w:rPr>
+          <w:rFonts w:ascii="Calibri" w:hAnsi="Calibri"/>
+          <w:sz w:val="22"/>
+        </w:rPr>
+        <w:t xml:space="preserve">, </w:t>
+      </w:r>
+      <w:r>
+        <w:rPr>
+          <w:rFonts w:ascii="Calibri" w:hAnsi="Calibri"/>
+          <w:sz w:val="20"/>
+        </w:rPr>
+        <w:t>deploy/</w:t>
+      </w:r>
+      <w:r>
+        <w:rPr>
+          <w:rFonts w:ascii="Calibri" w:hAnsi="Calibri"/>
+          <w:sz w:val="22"/>
+        </w:rPr>
+        <w:t xml:space="preserve">, </w:t>
+      </w:r>
+      <w:r>
+        <w:rPr>
+          <w:rFonts w:ascii="Calibri" w:hAnsi="Calibri"/>
+          <w:sz w:val="20"/>
+        </w:rPr>
+        <w:t>mock-spin/</w:t>
+      </w:r>
+      <w:r>
+        <w:rPr>
+          <w:rFonts w:ascii="Calibri" w:hAnsi="Calibri"/>
+          <w:sz w:val="22"/>
+        </w:rPr>
+        <w:t xml:space="preserve">, etc. (no hay subcarpeta </w:t>
+      </w:r>
+      <w:r>
+        <w:rPr>
+          <w:rFonts w:ascii="Calibri" w:hAnsi="Calibri"/>
+          <w:sz w:val="20"/>
+        </w:rPr>
+        <w:t>comision-variable/</w:t>
+      </w:r>
+      <w:r>
+        <w:rPr>
+          <w:rFonts w:ascii="Calibri" w:hAnsi="Calibri"/>
+          <w:sz w:val="22"/>
+        </w:rPr>
+        <w:t xml:space="preserve">). Tras el </w:t>
+      </w:r>
+      <w:r>
+        <w:rPr>
+          <w:rFonts w:ascii="Calibri" w:hAnsi="Calibri"/>
+          <w:sz w:val="20"/>
+        </w:rPr>
+        <w:t>cd</w:t>
+      </w:r>
+      <w:r>
+        <w:rPr>
+          <w:rFonts w:ascii="Calibri" w:hAnsi="Calibri"/>
+          <w:sz w:val="22"/>
+        </w:rPr>
+        <w:t xml:space="preserve"> ya estás en la raíz correcta.</w:t>
+      </w:r>
+    </w:p>
+    <w:p>
+      <w:r>
+        <w:rPr>
+          <w:rFonts w:ascii="Calibri" w:hAnsi="Calibri"/>
+          <w:b/>
+          <w:sz w:val="22"/>
+        </w:rPr>
+        <w:t>Paso 6 — Desplegar el servicio (un comando).</w:t>
+      </w:r>
+      <w:r>
+        <w:rPr>
+          <w:rFonts w:ascii="Calibri" w:hAnsi="Calibri"/>
+          <w:sz w:val="22"/>
+        </w:rPr>
+        <w:t xml:space="preserve"> Desde la raíz del repo (donde quedaste tras el </w:t>
+      </w:r>
+      <w:r>
+        <w:rPr>
+          <w:rFonts w:ascii="Calibri" w:hAnsi="Calibri"/>
+          <w:sz w:val="20"/>
+        </w:rPr>
+        <w:t>cd</w:t>
+      </w:r>
+      <w:r>
+        <w:rPr>
+          <w:rFonts w:ascii="Calibri" w:hAnsi="Calibri"/>
+          <w:sz w:val="22"/>
+        </w:rPr>
+        <w:t>):</w:t>
       </w:r>
     </w:p>
     <w:p>
@@ -2026,7 +2307,7 @@
           <w:b/>
           <w:sz w:val="22"/>
         </w:rPr>
-        <w:t>Paso 6 — Verificar que arrancó.</w:t>
+        <w:t>Paso 7 — Verificar que arrancó.</w:t>
       </w:r>
     </w:p>
     <w:p>
@@ -2054,7 +2335,7 @@
           <w:b/>
           <w:sz w:val="22"/>
         </w:rPr>
-        <w:t>Paso 7 — Probar el endpoint.</w:t>
+        <w:t>Paso 8 — Probar el endpoint.</w:t>
       </w:r>
     </w:p>
     <w:p>

</xml_diff>

<commit_message>
feat: spin-mock-service dirigido por BD (escenario_spin)
</commit_message>
<xml_diff>
--- a/docs/Runbook_v0.1.docx
+++ b/docs/Runbook_v0.1.docx
@@ -392,6 +392,88 @@
                 <w:sz w:val="20"/>
               </w:rPr>
               <w:t>Sección 4.5: agregado paso de clonación del repo en terminal (Web Terminal / local) y nota de estructura aplanada.</w:t>
+            </w:r>
+          </w:p>
+        </w:tc>
+      </w:tr>
+      <w:tr>
+        <w:tc>
+          <w:tcPr>
+            <w:tcW w:type="dxa" w:w="2351"/>
+          </w:tcPr>
+          <w:p>
+            <w:r>
+              <w:rPr>
+                <w:rFonts w:ascii="Calibri" w:hAnsi="Calibri"/>
+                <w:sz w:val="20"/>
+              </w:rPr>
+            </w:r>
+            <w:r>
+              <w:rPr>
+                <w:rFonts w:ascii="Calibri" w:hAnsi="Calibri"/>
+                <w:sz w:val="20"/>
+              </w:rPr>
+              <w:t>0.4</w:t>
+            </w:r>
+          </w:p>
+        </w:tc>
+        <w:tc>
+          <w:tcPr>
+            <w:tcW w:type="dxa" w:w="2351"/>
+          </w:tcPr>
+          <w:p>
+            <w:r>
+              <w:rPr>
+                <w:rFonts w:ascii="Calibri" w:hAnsi="Calibri"/>
+                <w:sz w:val="20"/>
+              </w:rPr>
+            </w:r>
+            <w:r>
+              <w:rPr>
+                <w:rFonts w:ascii="Calibri" w:hAnsi="Calibri"/>
+                <w:sz w:val="20"/>
+              </w:rPr>
+              <w:t>08/06/2026</w:t>
+            </w:r>
+          </w:p>
+        </w:tc>
+        <w:tc>
+          <w:tcPr>
+            <w:tcW w:type="dxa" w:w="2351"/>
+          </w:tcPr>
+          <w:p>
+            <w:r>
+              <w:rPr>
+                <w:rFonts w:ascii="Calibri" w:hAnsi="Calibri"/>
+                <w:sz w:val="20"/>
+              </w:rPr>
+            </w:r>
+            <w:r>
+              <w:rPr>
+                <w:rFonts w:ascii="Calibri" w:hAnsi="Calibri"/>
+                <w:sz w:val="20"/>
+              </w:rPr>
+              <w:t>Roberto Castillo</w:t>
+            </w:r>
+          </w:p>
+        </w:tc>
+        <w:tc>
+          <w:tcPr>
+            <w:tcW w:type="dxa" w:w="2351"/>
+          </w:tcPr>
+          <w:p>
+            <w:r>
+              <w:rPr>
+                <w:rFonts w:ascii="Calibri" w:hAnsi="Calibri"/>
+                <w:sz w:val="20"/>
+              </w:rPr>
+            </w:r>
+            <w:r>
+              <w:rPr>
+                <w:rFonts w:ascii="Calibri" w:hAnsi="Calibri"/>
+                <w:sz w:val="20"/>
+              </w:rPr>
+              <w:t>Agregada sección 4.6: obtener token vía Route de Keycloak (sin script).</w:t>
             </w:r>
           </w:p>
         </w:tc>
@@ -2714,6 +2796,339 @@
     <w:p/>
     <w:p>
       <w:pPr>
+        <w:pStyle w:val="Heading3"/>
+      </w:pPr>
+      <w:r>
+        <w:rPr>
+          <w:rFonts w:ascii="Calibri" w:hAnsi="Calibri"/>
+          <w:b/>
+          <w:sz w:val="28"/>
+        </w:rPr>
+        <w:t>4.6 Obtener token vía Route de Keycloak (sin script)</w:t>
+      </w:r>
+    </w:p>
+    <w:p>
+      <w:r>
+        <w:rPr>
+          <w:rFonts w:ascii="Calibri" w:hAnsi="Calibri"/>
+          <w:sz w:val="22"/>
+        </w:rPr>
+        <w:t xml:space="preserve">Alternativa a </w:t>
+      </w:r>
+      <w:r>
+        <w:rPr>
+          <w:rFonts w:ascii="Calibri" w:hAnsi="Calibri"/>
+          <w:sz w:val="20"/>
+        </w:rPr>
+        <w:t>get-token.sh</w:t>
+      </w:r>
+      <w:r>
+        <w:rPr>
+          <w:rFonts w:ascii="Calibri" w:hAnsi="Calibri"/>
+          <w:sz w:val="22"/>
+        </w:rPr>
+        <w:t xml:space="preserve">: exponer Keycloak con una Route y pedir el token directo al endpoint OIDC estándar desde curl, Postman o el navegador (sin </w:t>
+      </w:r>
+      <w:r>
+        <w:rPr>
+          <w:rFonts w:ascii="Calibri" w:hAnsi="Calibri"/>
+          <w:sz w:val="20"/>
+        </w:rPr>
+        <w:t>port-forward</w:t>
+      </w:r>
+      <w:r>
+        <w:rPr>
+          <w:rFonts w:ascii="Calibri" w:hAnsi="Calibri"/>
+          <w:sz w:val="22"/>
+        </w:rPr>
+        <w:t xml:space="preserve"> ni script).</w:t>
+      </w:r>
+    </w:p>
+    <w:p>
+      <w:r>
+        <w:rPr>
+          <w:rFonts w:ascii="Calibri" w:hAnsi="Calibri"/>
+          <w:b/>
+          <w:sz w:val="22"/>
+        </w:rPr>
+        <w:t>Paso 1 — Exponer Keycloak con una Route (edge TLS).</w:t>
+      </w:r>
+      <w:r>
+        <w:rPr>
+          <w:rFonts w:ascii="Calibri" w:hAnsi="Calibri"/>
+          <w:sz w:val="22"/>
+        </w:rPr>
+        <w:t xml:space="preserve"> Una sola vez:</w:t>
+      </w:r>
+    </w:p>
+    <w:p>
+      <w:pPr>
+        <w:shd w:val="clear" w:fill="F2F2F2"/>
+      </w:pPr>
+      <w:r>
+        <w:rPr>
+          <w:rFonts w:ascii="Consolas" w:hAnsi="Consolas"/>
+          <w:sz w:val="18"/>
+        </w:rPr>
+        <w:t>oc create route edge keycloak --service=keycloak --port=8080</w:t>
+        <w:br/>
+        <w:t>KC=$(oc get route keycloak -o jsonpath='{.spec.host}')</w:t>
+        <w:br/>
+        <w:t>echo "https://$KC"</w:t>
+      </w:r>
+    </w:p>
+    <w:p>
+      <w:r>
+        <w:rPr>
+          <w:rFonts w:ascii="Calibri" w:hAnsi="Calibri"/>
+          <w:b/>
+          <w:sz w:val="22"/>
+        </w:rPr>
+        <w:t>Paso 2 — Pedir el token al endpoint OIDC.</w:t>
+      </w:r>
+      <w:r>
+        <w:rPr>
+          <w:rFonts w:ascii="Calibri" w:hAnsi="Calibri"/>
+          <w:sz w:val="22"/>
+        </w:rPr>
+        <w:t xml:space="preserve"> Endpoint estándar del realm:</w:t>
+      </w:r>
+    </w:p>
+    <w:p>
+      <w:pPr>
+        <w:shd w:val="clear" w:fill="F2F2F2"/>
+      </w:pPr>
+      <w:r>
+        <w:rPr>
+          <w:rFonts w:ascii="Consolas" w:hAnsi="Consolas"/>
+          <w:sz w:val="18"/>
+        </w:rPr>
+        <w:t>POST https://&lt;keycloak-route&gt;/realms/applications/protocol/openid-connect/token</w:t>
+        <w:br/>
+        <w:t>Content-Type: application/x-www-form-urlencoded</w:t>
+        <w:br/>
+        <w:t>grant_type=client_credentials &amp; client_id=pos-client &amp; client_secret=pos-secret</w:t>
+      </w:r>
+    </w:p>
+    <w:p>
+      <w:r>
+        <w:rPr>
+          <w:rFonts w:ascii="Calibri" w:hAnsi="Calibri"/>
+          <w:sz w:val="22"/>
+        </w:rPr>
+        <w:t>Con curl:</w:t>
+      </w:r>
+    </w:p>
+    <w:p>
+      <w:pPr>
+        <w:shd w:val="clear" w:fill="F2F2F2"/>
+      </w:pPr>
+      <w:r>
+        <w:rPr>
+          <w:rFonts w:ascii="Consolas" w:hAnsi="Consolas"/>
+          <w:sz w:val="18"/>
+        </w:rPr>
+        <w:t>curl -s -X POST "https://$KC/realms/applications/protocol/openid-connect/token" \</w:t>
+        <w:br/>
+        <w:t xml:space="preserve">  -H "Content-Type: application/x-www-form-urlencoded" \</w:t>
+        <w:br/>
+        <w:t xml:space="preserve">  -d grant_type=client_credentials -d client_id=pos-client -d client_secret=pos-secret</w:t>
+      </w:r>
+    </w:p>
+    <w:p>
+      <w:r>
+        <w:rPr>
+          <w:rFonts w:ascii="Calibri" w:hAnsi="Calibri"/>
+          <w:sz w:val="22"/>
+        </w:rPr>
+        <w:t xml:space="preserve">Devuelve un JSON con </w:t>
+      </w:r>
+      <w:r>
+        <w:rPr>
+          <w:rFonts w:ascii="Calibri" w:hAnsi="Calibri"/>
+          <w:sz w:val="20"/>
+        </w:rPr>
+        <w:t>access_token</w:t>
+      </w:r>
+      <w:r>
+        <w:rPr>
+          <w:rFonts w:ascii="Calibri" w:hAnsi="Calibri"/>
+          <w:sz w:val="22"/>
+        </w:rPr>
+        <w:t xml:space="preserve"> (vigencia ~5 min, </w:t>
+      </w:r>
+      <w:r>
+        <w:rPr>
+          <w:rFonts w:ascii="Calibri" w:hAnsi="Calibri"/>
+          <w:sz w:val="20"/>
+        </w:rPr>
+        <w:t>accessTokenLifespan</w:t>
+      </w:r>
+      <w:r>
+        <w:rPr>
+          <w:rFonts w:ascii="Calibri" w:hAnsi="Calibri"/>
+          <w:sz w:val="22"/>
+        </w:rPr>
+        <w:t xml:space="preserve"> del realm).</w:t>
+      </w:r>
+    </w:p>
+    <w:p>
+      <w:r>
+        <w:rPr>
+          <w:rFonts w:ascii="Calibri" w:hAnsi="Calibri"/>
+          <w:b/>
+          <w:sz w:val="22"/>
+        </w:rPr>
+        <w:t>Paso 3 — Usar el token.</w:t>
+      </w:r>
+      <w:r>
+        <w:rPr>
+          <w:rFonts w:ascii="Calibri" w:hAnsi="Calibri"/>
+          <w:sz w:val="22"/>
+        </w:rPr>
+        <w:t xml:space="preserve"> En Swagger UI (</w:t>
+      </w:r>
+      <w:r>
+        <w:rPr>
+          <w:rFonts w:ascii="Calibri" w:hAnsi="Calibri"/>
+          <w:sz w:val="20"/>
+        </w:rPr>
+        <w:t>/swagger-ui</w:t>
+      </w:r>
+      <w:r>
+        <w:rPr>
+          <w:rFonts w:ascii="Calibri" w:hAnsi="Calibri"/>
+          <w:sz w:val="22"/>
+        </w:rPr>
+        <w:t xml:space="preserve">) → </w:t>
+      </w:r>
+      <w:r>
+        <w:rPr>
+          <w:rFonts w:ascii="Calibri" w:hAnsi="Calibri"/>
+          <w:i/>
+          <w:sz w:val="22"/>
+        </w:rPr>
+        <w:t>Authorize</w:t>
+      </w:r>
+      <w:r>
+        <w:rPr>
+          <w:rFonts w:ascii="Calibri" w:hAnsi="Calibri"/>
+          <w:sz w:val="22"/>
+        </w:rPr>
+        <w:t xml:space="preserve"> → pega solo el </w:t>
+      </w:r>
+      <w:r>
+        <w:rPr>
+          <w:rFonts w:ascii="Calibri" w:hAnsi="Calibri"/>
+          <w:sz w:val="20"/>
+        </w:rPr>
+        <w:t>access_token</w:t>
+      </w:r>
+      <w:r>
+        <w:rPr>
+          <w:rFonts w:ascii="Calibri" w:hAnsi="Calibri"/>
+          <w:sz w:val="22"/>
+        </w:rPr>
+        <w:t>. O con curl al endpoint de negocio:</w:t>
+      </w:r>
+    </w:p>
+    <w:p>
+      <w:pPr>
+        <w:shd w:val="clear" w:fill="F2F2F2"/>
+      </w:pPr>
+      <w:r>
+        <w:rPr>
+          <w:rFonts w:ascii="Consolas" w:hAnsi="Consolas"/>
+          <w:sz w:val="18"/>
+        </w:rPr>
+        <w:t>TOKEN="&lt;access_token&gt;"</w:t>
+        <w:br/>
+        <w:t>ROUTE=$(oc get route comision-variable -o jsonpath='{.spec.host}')</w:t>
+        <w:br/>
+        <w:t>curl -s -X POST "https://$ROUTE/rest/v1/comision-variable/comision" \</w:t>
+        <w:br/>
+        <w:t xml:space="preserve">  -H "Authorization: Bearer $TOKEN" -H "Content-Type: application/json" \</w:t>
+        <w:br/>
+        <w:t xml:space="preserve">  -d '{"id":"POS-1","plaza":"PLZ-001","tienda":"TND-04521","caja":"CAJA-03","transaccion":"TRX-1","servicio":"SERV-TAE-ATT"}'</w:t>
+      </w:r>
+    </w:p>
+    <w:p>
+      <w:r>
+        <w:rPr>
+          <w:rFonts w:ascii="Calibri" w:hAnsi="Calibri"/>
+          <w:b/>
+          <w:sz w:val="22"/>
+        </w:rPr>
+        <w:t>Paso 4 — (Opcional) Postman.</w:t>
+      </w:r>
+      <w:r>
+        <w:rPr>
+          <w:rFonts w:ascii="Calibri" w:hAnsi="Calibri"/>
+          <w:sz w:val="22"/>
+        </w:rPr>
+        <w:t xml:space="preserve"> En el </w:t>
+      </w:r>
+      <w:r>
+        <w:rPr>
+          <w:rFonts w:ascii="Calibri" w:hAnsi="Calibri"/>
+          <w:i/>
+          <w:sz w:val="22"/>
+        </w:rPr>
+        <w:t>environment</w:t>
+      </w:r>
+      <w:r>
+        <w:rPr>
+          <w:rFonts w:ascii="Calibri" w:hAnsi="Calibri"/>
+          <w:sz w:val="22"/>
+        </w:rPr>
+        <w:t xml:space="preserve"> de la colección, fija </w:t>
+      </w:r>
+      <w:r>
+        <w:rPr>
+          <w:rFonts w:ascii="Calibri" w:hAnsi="Calibri"/>
+          <w:sz w:val="20"/>
+        </w:rPr>
+        <w:t>keycloak_url = https://&lt;keycloak-route&gt;</w:t>
+      </w:r>
+      <w:r>
+        <w:rPr>
+          <w:rFonts w:ascii="Calibri" w:hAnsi="Calibri"/>
+          <w:sz w:val="22"/>
+        </w:rPr>
+        <w:t xml:space="preserve"> y ejecuta el request "1. Obtener token"; el resto de la colección reusa el </w:t>
+      </w:r>
+      <w:r>
+        <w:rPr>
+          <w:rFonts w:ascii="Calibri" w:hAnsi="Calibri"/>
+          <w:sz w:val="20"/>
+        </w:rPr>
+        <w:t>access_token</w:t>
+      </w:r>
+      <w:r>
+        <w:rPr>
+          <w:rFonts w:ascii="Calibri" w:hAnsi="Calibri"/>
+          <w:sz w:val="22"/>
+        </w:rPr>
+        <w:t>.</w:t>
+      </w:r>
+    </w:p>
+    <w:p>
+      <w:r>
+        <w:rPr>
+          <w:rFonts w:ascii="Calibri" w:hAnsi="Calibri"/>
+          <w:i/>
+          <w:color w:val="555555"/>
+          <w:sz w:val="20"/>
+        </w:rPr>
+        <w:t>Notas:</w:t>
+        <w:br/>
+        <w:t>- Keycloak ya está configurado para vivir detrás de la Route (`KC_HOSTNAME_STRICT=false`, `KC_PROXY_HEADERS=xforwarded`). Si algún flujo marcara error de hostname: `oc set env deploy/keycloak KC_HOSTNAME=https://$KC` y reiniciar.</w:t>
+        <w:br/>
+        <w:t>- **Seguridad:** exponer Keycloak con Route es adecuado para el piloto, pero deja el endpoint de token público; fuera del piloto, restringir su acceso.</w:t>
+      </w:r>
+    </w:p>
+    <w:p>
+      <w:pPr>
         <w:pStyle w:val="Heading2"/>
       </w:pPr>
       <w:r>

</xml_diff>